<commit_message>
Xuat lai 3 file Word sau khi export_office ho tro khoi trich dan va bo duong ke ngang: BAO-CAO.docx, bo-tai-lieu-bao-ve.docx, BAO-CAO-phan-bien.docx (het ky tu '>' va dong '---'; so tieu de/bang khong doi)
</commit_message>
<xml_diff>
--- a/docs/BAO-CAO-phan-bien.docx
+++ b/docs/BAO-CAO-phan-bien.docx
@@ -176,9 +176,9 @@
       </w:tr>
     </w:tbl>
     <w:p>
-      <w:r>
-        <w:t xml:space="preserve">&gt; </w:t>
-      </w:r>
+      <w:pPr>
+        <w:ind w:left="432"/>
+      </w:pPr>
       <w:r>
         <w:rPr>
           <w:b/>
@@ -186,12 +186,7 @@
         <w:t>Nguyên tắc số liệu của báo cáo.</w:t>
       </w:r>
       <w:r>
-        <w:t xml:space="preserve"> Mọi con số trong báo cáo này được đọc trực tiếp từ artifact do</w:t>
-      </w:r>
-    </w:p>
-    <w:p>
-      <w:r>
-        <w:t>&gt; chính mã nguồn sinh ra (</w:t>
+        <w:t xml:space="preserve"> Mọi con số trong báo cáo này được đọc trực tiếp từ artifact do chính mã nguồn sinh ra (</w:t>
       </w:r>
       <w:r>
         <w:rPr>
@@ -209,12 +204,7 @@
         <w:t>reports/imbalance/*</w:t>
       </w:r>
       <w:r>
-        <w:t>,</w:t>
-      </w:r>
-    </w:p>
-    <w:p>
-      <w:r>
-        <w:t xml:space="preserve">&gt; </w:t>
+        <w:t xml:space="preserve">, </w:t>
       </w:r>
       <w:r>
         <w:rPr>
@@ -232,12 +222,7 @@
         <w:t>reports/experiment/*</w:t>
       </w:r>
       <w:r>
-        <w:t>). Không có số nào được nhập tay: chạy</w:t>
-      </w:r>
-    </w:p>
-    <w:p>
-      <w:r>
-        <w:t xml:space="preserve">&gt; </w:t>
+        <w:t xml:space="preserve">). Không có số nào được nhập tay: chạy </w:t>
       </w:r>
       <w:r>
         <w:rPr>
@@ -255,12 +240,7 @@
         <w:t>python -m scripts.make_report</w:t>
       </w:r>
       <w:r>
-        <w:t xml:space="preserve"> là báo cáo tự khớp lại với kết quả.</w:t>
-      </w:r>
-    </w:p>
-    <w:p>
-      <w:r>
-        <w:t>&gt; Vì vậy mọi bảng dưới đây có thể được Hội đồng đối chiếu lại ngay tại chỗ.</w:t>
+        <w:t xml:space="preserve"> là báo cáo tự khớp lại với kết quả. Vì vậy mọi bảng dưới đây có thể được Hội đồng đối chiếu lại ngay tại chỗ.</w:t>
       </w:r>
     </w:p>
     <w:p>
@@ -917,11 +897,6 @@
         </w:tc>
       </w:tr>
     </w:tbl>
-    <w:p>
-      <w:r>
-        <w:t>---</w:t>
-      </w:r>
-    </w:p>
     <w:p>
       <w:pPr>
         <w:pStyle w:val="Heading1"/>
@@ -2155,11 +2130,6 @@
       </w:r>
       <w:r>
         <w:t xml:space="preserve"> phát hiện.</w:t>
-      </w:r>
-    </w:p>
-    <w:p>
-      <w:r>
-        <w:t>---</w:t>
       </w:r>
     </w:p>
     <w:p>
@@ -5069,11 +5039,6 @@
       </w:r>
     </w:p>
     <w:p>
-      <w:r>
-        <w:t>---</w:t>
-      </w:r>
-    </w:p>
-    <w:p>
       <w:pPr>
         <w:pStyle w:val="Heading2"/>
       </w:pPr>
@@ -6183,11 +6148,6 @@
       </w:r>
     </w:p>
     <w:p>
-      <w:r>
-        <w:t>---</w:t>
-      </w:r>
-    </w:p>
-    <w:p>
       <w:pPr>
         <w:pStyle w:val="Heading2"/>
       </w:pPr>
@@ -6575,9 +6535,9 @@
       </w:r>
     </w:p>
     <w:p>
-      <w:r>
-        <w:t xml:space="preserve">&gt; </w:t>
-      </w:r>
+      <w:pPr>
+        <w:ind w:left="432"/>
+      </w:pPr>
       <w:r>
         <w:rPr>
           <w:b/>
@@ -6603,12 +6563,7 @@
         <w:t>HistGradientBoostingClassifier</w:t>
       </w:r>
       <w:r>
-        <w:t xml:space="preserve"> mặc định</w:t>
-      </w:r>
-    </w:p>
-    <w:p>
-      <w:r>
-        <w:t xml:space="preserve">&gt; là </w:t>
+        <w:t xml:space="preserve"> mặc định là </w:t>
       </w:r>
       <w:r>
         <w:rPr>
@@ -6626,12 +6581,7 @@
         <w:t>&gt; 10.000 mẫu</w:t>
       </w:r>
       <w:r>
-        <w:t>, mà ở đây</w:t>
-      </w:r>
-    </w:p>
-    <w:p>
-      <w:r>
-        <w:t xml:space="preserve">&gt; chỉ có </w:t>
+        <w:t xml:space="preserve">, mà ở đây chỉ có </w:t>
       </w:r>
       <w:r>
         <w:rPr>
@@ -6649,17 +6599,7 @@
         <w:t>không</w:t>
       </w:r>
       <w:r>
-        <w:t xml:space="preserve"> kích hoạt. Việc chống overfitting cho mô hình này đến từ ba ràng buộc</w:t>
-      </w:r>
-    </w:p>
-    <w:p>
-      <w:r>
-        <w:t>&gt; cấu trúc vừa nêu, và điều đó được kiểm chứng bằng số ở Chương 6.4 (gap train−val = 0,0260).</w:t>
-      </w:r>
-    </w:p>
-    <w:p>
-      <w:r>
-        <w:t>---</w:t>
+        <w:t xml:space="preserve"> kích hoạt. Việc chống overfitting cho mô hình này đến từ ba ràng buộc cấu trúc vừa nêu, và điều đó được kiểm chứng bằng số ở Chương 6.4 (gap train−val = 0,0260).</w:t>
       </w:r>
     </w:p>
     <w:p>
@@ -7611,9 +7551,9 @@
       </w:r>
     </w:p>
     <w:p>
-      <w:r>
-        <w:t xml:space="preserve">&gt; </w:t>
-      </w:r>
+      <w:pPr>
+        <w:ind w:left="432"/>
+      </w:pPr>
       <w:r>
         <w:rPr>
           <w:rFonts w:ascii="Consolas" w:hAnsi="Consolas"/>
@@ -7842,11 +7782,6 @@
     <w:p>
       <w:r>
         <w:t>hình to hơn").</w:t>
-      </w:r>
-    </w:p>
-    <w:p>
-      <w:r>
-        <w:t>---</w:t>
       </w:r>
     </w:p>
     <w:p>
@@ -9572,11 +9507,6 @@
       </w:r>
     </w:p>
     <w:p>
-      <w:r>
-        <w:t>---</w:t>
-      </w:r>
-    </w:p>
-    <w:p>
       <w:pPr>
         <w:pStyle w:val="Heading1"/>
       </w:pPr>
@@ -11180,11 +11110,6 @@
     <w:p>
       <w:r>
         <w:t>(Platt/isotonic, fit trên train/validation) — chính là khuyến nghị P2 của đồ án.</w:t>
-      </w:r>
-    </w:p>
-    <w:p>
-      <w:r>
-        <w:t>---</w:t>
       </w:r>
     </w:p>
     <w:p>
@@ -12694,11 +12619,6 @@
     <w:p>
       <w:r>
         <w:t>lựa chọn có chủ đích và nên được nêu trước khi bị hỏi.</w:t>
-      </w:r>
-    </w:p>
-    <w:p>
-      <w:r>
-        <w:t>---</w:t>
       </w:r>
     </w:p>
     <w:p>
@@ -17850,11 +17770,6 @@
     <w:p>
       <w:r>
         <w:t>sửa được lỗi nằm ở tầng nhãn (Chương 6.3).</w:t>
-      </w:r>
-    </w:p>
-    <w:p>
-      <w:r>
-        <w:t>---</w:t>
       </w:r>
     </w:p>
     <w:p>
@@ -19194,11 +19109,6 @@
         </w:tc>
       </w:tr>
     </w:tbl>
-    <w:p>
-      <w:r>
-        <w:t>---</w:t>
-      </w:r>
-    </w:p>
     <w:p>
       <w:pPr>
         <w:pStyle w:val="Heading2"/>
@@ -19588,9 +19498,9 @@
       </w:tr>
     </w:tbl>
     <w:p>
-      <w:r>
-        <w:t xml:space="preserve">&gt; </w:t>
-      </w:r>
+      <w:pPr>
+        <w:ind w:left="432"/>
+      </w:pPr>
       <w:r>
         <w:rPr>
           <w:b/>
@@ -19598,12 +19508,7 @@
         <w:t>Ghi chú định dạng:</w:t>
       </w:r>
       <w:r>
-        <w:t xml:space="preserve"> công thức trong thân báo cáo viết ở dạng Unicode-math (hiển thị đúng trong cả Word</w:t>
-      </w:r>
-    </w:p>
-    <w:p>
-      <w:r>
-        <w:t>&gt; và Markdown); Phụ lục A là bản LaTeX tương ứng để chèn vào Equation Editor khi cần trình bày chuẩn.</w:t>
+        <w:t xml:space="preserve"> công thức trong thân báo cáo viết ở dạng Unicode-math (hiển thị đúng trong cả Word và Markdown); Phụ lục A là bản LaTeX tương ứng để chèn vào Equation Editor khi cần trình bày chuẩn.</w:t>
       </w:r>
     </w:p>
     <w:sectPr>

</xml_diff>